<commit_message>
fix(submission): rename department to 'Department of Laboratory Medicine' (EN)
</commit_message>
<xml_diff>
--- a/paper/cover_letter_CCLM.docx
+++ b/paper/cover_letter_CCLM.docx
@@ -102,7 +102,7 @@
           <w:b/>
           <w:sz w:val="22"/>
         </w:rPr>
-        <w:t>Department of Clinical Laboratory, West China Hospital Xiamen, Sichuan University</w:t>
+        <w:t>Department of Laboratory Medicine, West China Hospital Xiamen, Sichuan University</w:t>
       </w:r>
     </w:p>
     <w:p>
@@ -612,7 +612,7 @@
           <w:b w:val="0"/>
           <w:sz w:val="22"/>
         </w:rPr>
-        <w:t>Department of Clinical Laboratory, West China Hospital Xiamen, Sichuan University, Xiamen, Fujian, China</w:t>
+        <w:t>Department of Laboratory Medicine, West China Hospital Xiamen, Sichuan University, Xiamen, Fujian, China</w:t>
       </w:r>
     </w:p>
     <w:p>

</xml_diff>

<commit_message>
docs(paper): finalize resubmission package (abstract C_full gloss, dated cover letter, point-by-point response)
Co-Authored-By: Claude Fable 5 <noreply@anthropic.com>
Claude-Session: https://claude.ai/code/session_01PXteLoEJ47ztdLQyNFxNJ9
</commit_message>
<xml_diff>
--- a/paper/cover_letter_CCLM.docx
+++ b/paper/cover_letter_CCLM.docx
@@ -111,7 +111,7 @@
           <w:i w:val="0"/>
           <w:sz w:val="24"/>
         </w:rPr>
-        <w:t>[Date]</w:t>
+        <w:t>3 August 2026</w:t>
       </w:r>
     </w:p>
     <w:p>
@@ -127,7 +127,7 @@
           <w:i w:val="0"/>
           <w:sz w:val="24"/>
         </w:rPr>
-        <w:t>Dear Editor-in-Chief,</w:t>
+        <w:t>Dear Professor Plebani,</w:t>
       </w:r>
     </w:p>
     <w:p>
@@ -678,20 +678,11 @@
       <w:r>
         <w:rPr>
           <w:rFonts w:ascii="Times New Roman" w:hAnsi="Times New Roman" w:eastAsia="宋体"/>
-          <w:b/>
-          <w:i w:val="0"/>
-          <w:sz w:val="24"/>
-        </w:rPr>
-        <w:t>[Date]</w:t>
-      </w:r>
-      <w:r>
-        <w:rPr>
-          <w:rFonts w:ascii="Times New Roman" w:hAnsi="Times New Roman" w:eastAsia="宋体"/>
           <w:b w:val="0"/>
           <w:i w:val="0"/>
           <w:sz w:val="24"/>
         </w:rPr>
-        <w:t xml:space="preserve"> 填投稿当日；如系统允许指名主编，把 "Dear Editor-in-Chief" 换成现任主编姓名（投稿前在 CCLM 官网核实）</w:t>
+        <w:t>日期已填 2026-08-03；称呼已指名 Plebani（2026-05-21 决定信签发人，官网在列，已核实）</w:t>
       </w:r>
     </w:p>
     <w:p>

</xml_diff>

<commit_message>
fix(submission): stop internal notes from rendering into submitted Word files
The converter now drops blockquote lines and everything after an <!--internal--> marker,
which had leaked Chinese working notes into the response letter and cover letter.
Supplementary tables now lead with the English version.

Co-Authored-By: Claude Fable 5 <noreply@anthropic.com>
Claude-Session: https://claude.ai/code/session_01PXteLoEJ47ztdLQyNFxNJ9
</commit_message>
<xml_diff>
--- a/paper/cover_letter_CCLM.docx
+++ b/paper/cover_letter_CCLM.docx
@@ -2,102 +2,6 @@
 <file path=word/document.xml><?xml version="1.0" encoding="utf-8"?>
 <w:document xmlns:wpc="http://schemas.microsoft.com/office/word/2010/wordprocessingCanvas" xmlns:mo="http://schemas.microsoft.com/office/mac/office/2008/main" xmlns:mc="http://schemas.openxmlformats.org/markup-compatibility/2006" xmlns:mv="urn:schemas-microsoft-com:mac:vml" xmlns:o="urn:schemas-microsoft-com:office:office" xmlns:r="http://schemas.openxmlformats.org/officeDocument/2006/relationships" xmlns:m="http://schemas.openxmlformats.org/officeDocument/2006/math" xmlns:v="urn:schemas-microsoft-com:vml" xmlns:wp14="http://schemas.microsoft.com/office/word/2010/wordprocessingDrawing" xmlns:wp="http://schemas.openxmlformats.org/drawingml/2006/wordprocessingDrawing" xmlns:w10="urn:schemas-microsoft-com:office:word" xmlns:w="http://schemas.openxmlformats.org/wordprocessingml/2006/main" xmlns:w14="http://schemas.microsoft.com/office/word/2010/wordml" xmlns:wpg="http://schemas.microsoft.com/office/word/2010/wordprocessingGroup" xmlns:wpi="http://schemas.microsoft.com/office/word/2010/wordprocessingInk" xmlns:wne="http://schemas.microsoft.com/office/word/2006/wordml" xmlns:wps="http://schemas.microsoft.com/office/word/2010/wordprocessingShape" mc:Ignorable="w14 wp14">
   <w:body>
-    <w:p>
-      <w:pPr>
-        <w:spacing w:before="240" w:after="240" w:lineRule="auto" w:line="360"/>
-        <w:jc w:val="center"/>
-      </w:pPr>
-      <w:r>
-        <w:rPr>
-          <w:rFonts w:ascii="Times New Roman" w:hAnsi="Times New Roman" w:eastAsia="宋体"/>
-          <w:b/>
-          <w:i w:val="0"/>
-          <w:sz w:val="30"/>
-        </w:rPr>
-        <w:t>Cover Letter for CCLM Resubmission</w:t>
-      </w:r>
-    </w:p>
-    <w:p>
-      <w:pPr>
-        <w:spacing w:before="80" w:after="80" w:lineRule="auto" w:line="360"/>
-        <w:ind w:firstLine="0"/>
-        <w:jc w:val="both"/>
-      </w:pPr>
-      <w:r>
-        <w:rPr>
-          <w:rFonts w:ascii="Times New Roman" w:hAnsi="Times New Roman" w:eastAsia="宋体"/>
-          <w:b w:val="0"/>
-          <w:i w:val="0"/>
-          <w:sz w:val="24"/>
-        </w:rPr>
-        <w:t xml:space="preserve">&gt; Target journal: </w:t>
-      </w:r>
-      <w:r>
-        <w:rPr>
-          <w:rFonts w:ascii="Times New Roman" w:hAnsi="Times New Roman" w:eastAsia="宋体"/>
-          <w:b w:val="0"/>
-          <w:i/>
-          <w:sz w:val="24"/>
-        </w:rPr>
-        <w:t>Clinical Chemistry and Laboratory Medicine</w:t>
-      </w:r>
-      <w:r>
-        <w:rPr>
-          <w:rFonts w:ascii="Times New Roman" w:hAnsi="Times New Roman" w:eastAsia="宋体"/>
-          <w:b w:val="0"/>
-          <w:i w:val="0"/>
-          <w:sz w:val="24"/>
-        </w:rPr>
-        <w:t xml:space="preserve"> (CCLM), De Gruyter Brill</w:t>
-      </w:r>
-    </w:p>
-    <w:p>
-      <w:pPr>
-        <w:spacing w:before="80" w:after="80" w:lineRule="auto" w:line="360"/>
-        <w:ind w:firstLine="0"/>
-        <w:jc w:val="both"/>
-      </w:pPr>
-      <w:r>
-        <w:rPr>
-          <w:rFonts w:ascii="Times New Roman" w:hAnsi="Times New Roman" w:eastAsia="宋体"/>
-          <w:b w:val="0"/>
-          <w:i w:val="0"/>
-          <w:sz w:val="24"/>
-        </w:rPr>
-        <w:t>&gt; Manuscript type: Original Article（reject-and-resubmit 重投版）</w:t>
-      </w:r>
-    </w:p>
-    <w:p>
-      <w:pPr>
-        <w:spacing w:before="80" w:after="80" w:lineRule="auto" w:line="360"/>
-        <w:ind w:firstLine="0"/>
-        <w:jc w:val="both"/>
-      </w:pPr>
-      <w:r>
-        <w:rPr>
-          <w:rFonts w:ascii="Times New Roman" w:hAnsi="Times New Roman" w:eastAsia="宋体"/>
-          <w:b w:val="0"/>
-          <w:i w:val="0"/>
-          <w:sz w:val="24"/>
-        </w:rPr>
-        <w:t>&gt; Submission system: Editorial Manager</w:t>
-      </w:r>
-    </w:p>
-    <w:p>
-      <w:pPr>
-        <w:spacing w:before="280" w:after="120" w:lineRule="auto" w:line="360"/>
-        <w:jc w:val="left"/>
-      </w:pPr>
-      <w:r>
-        <w:rPr>
-          <w:rFonts w:ascii="Times New Roman" w:hAnsi="Times New Roman" w:eastAsia="宋体"/>
-          <w:b/>
-          <w:i w:val="0"/>
-          <w:sz w:val="24"/>
-        </w:rPr>
-        <w:t>英文版（投稿使用）</w:t>
-      </w:r>
-    </w:p>
     <w:p>
       <w:pPr>
         <w:spacing w:before="80" w:after="80" w:lineRule="auto" w:line="360"/>
@@ -655,96 +559,6 @@
         <w:t>ORCID: 0000-0002-0290-6485</w:t>
       </w:r>
     </w:p>
-    <w:p>
-      <w:pPr>
-        <w:spacing w:before="280" w:after="120" w:lineRule="auto" w:line="360"/>
-        <w:jc w:val="left"/>
-      </w:pPr>
-      <w:r>
-        <w:rPr>
-          <w:rFonts w:ascii="Times New Roman" w:hAnsi="Times New Roman" w:eastAsia="宋体"/>
-          <w:b/>
-          <w:i w:val="0"/>
-          <w:sz w:val="24"/>
-        </w:rPr>
-        <w:t>中文辅助注释（不随稿提交，仅自用）</w:t>
-      </w:r>
-    </w:p>
-    <w:p>
-      <w:pPr>
-        <w:pStyle w:val="ListBullet"/>
-        <w:spacing w:before="40" w:after="40" w:lineRule="auto" w:line="360"/>
-      </w:pPr>
-      <w:r>
-        <w:rPr>
-          <w:rFonts w:ascii="Times New Roman" w:hAnsi="Times New Roman" w:eastAsia="宋体"/>
-          <w:b w:val="0"/>
-          <w:i w:val="0"/>
-          <w:sz w:val="24"/>
-        </w:rPr>
-        <w:t>日期已填 2026-08-03；称呼已指名 Plebani（2026-05-21 决定信签发人，官网在列，已核实）</w:t>
-      </w:r>
-    </w:p>
-    <w:p>
-      <w:pPr>
-        <w:pStyle w:val="ListBullet"/>
-        <w:spacing w:before="40" w:after="40" w:lineRule="auto" w:line="360"/>
-      </w:pPr>
-      <w:r>
-        <w:rPr>
-          <w:rFonts w:ascii="Times New Roman" w:hAnsi="Times New Roman" w:eastAsia="宋体"/>
-          <w:b w:val="0"/>
-          <w:i w:val="0"/>
-          <w:sz w:val="24"/>
-        </w:rPr>
-        <w:t>重投段落（第 2 段，引用 CCLM.2026.0735）是本轮新增——若你决定按全新投稿处理、不提前稿，删掉该段即可</w:t>
-      </w:r>
-    </w:p>
-    <w:p>
-      <w:pPr>
-        <w:pStyle w:val="ListBullet"/>
-        <w:spacing w:before="40" w:after="40" w:lineRule="auto" w:line="360"/>
-      </w:pPr>
-      <w:r>
-        <w:rPr>
-          <w:rFonts w:ascii="Times New Roman" w:hAnsi="Times New Roman" w:eastAsia="宋体"/>
-          <w:b w:val="0"/>
-          <w:i w:val="0"/>
-          <w:sz w:val="24"/>
-        </w:rPr>
-        <w:t>三位建议审稿人沿用首投版名单；若系统提示"曾评审过本稿"冲突，可换人</w:t>
-      </w:r>
-    </w:p>
-    <w:p>
-      <w:pPr>
-        <w:pStyle w:val="ListBullet"/>
-        <w:spacing w:before="40" w:after="40" w:lineRule="auto" w:line="360"/>
-      </w:pPr>
-      <w:r>
-        <w:rPr>
-          <w:rFonts w:ascii="Times New Roman" w:hAnsi="Times New Roman" w:eastAsia="宋体"/>
-          <w:b w:val="0"/>
-          <w:i w:val="0"/>
-          <w:sz w:val="24"/>
-        </w:rPr>
-        <w:t>信中 "To our knowledge, this is the first..." 保留是恰当的——cover letter 是向编辑推销新颖性的场合，与正文语气不同</w:t>
-      </w:r>
-    </w:p>
-    <w:p>
-      <w:pPr>
-        <w:pStyle w:val="ListBullet"/>
-        <w:spacing w:before="40" w:after="40" w:lineRule="auto" w:line="360"/>
-      </w:pPr>
-      <w:r>
-        <w:rPr>
-          <w:rFonts w:ascii="Times New Roman" w:hAnsi="Times New Roman" w:eastAsia="宋体"/>
-          <w:b w:val="0"/>
-          <w:i w:val="0"/>
-          <w:sz w:val="24"/>
-        </w:rPr>
-        <w:t>随稿附件清单：manuscript（含图版 docx/PDF）+ figures ×4（PNG 300dpi）+ Supplementary Material（S1 任务清单 + S2 评分量规）+ AI disclosure + point-by-point response + 本信</w:t>
-      </w:r>
-    </w:p>
     <w:sectPr>
       <w:pgSz w:w="12240" w:h="15840"/>
       <w:pgMar w:top="1417" w:right="1701" w:bottom="1417" w:left="1701" w:header="720" w:footer="720" w:gutter="0"/>

</xml_diff>